<commit_message>
Render math as Unicode instead of unrendered LaTeX
The reports used LaTeX inline math ($\pi$, $\lambda=0.95$, $\epsilon=0.2$,
$v_x$, $\omega_{yaw}$, etc.), but the docx builder is a plain-text converter and
does not render $...$, so the .docx showed raw LaTeX strings. These expressions
are all single Greek letters with subscripts (no fractions/integrals), so they
are now written as plain Unicode (π, λ = 0.95, ε = 0.2, vₓ, ω_yaw) that displays
correctly in any font without a math engine. Applied to all three report
variants.

Co-Authored-By: Claude Opus 4.8 <noreply@anthropic.com>
</commit_message>
<xml_diff>
--- a/docs/report/Final_Report.docx
+++ b/docs/report/Final_Report.docx
@@ -892,7 +892,7 @@
           <w:b w:val="0"/>
           <w:sz w:val="24"/>
         </w:rPr>
-        <w:t xml:space="preserve"> $\pi$ -- a function mapping states to actions -- that maximizes the expected long-term discounted reward.</w:t>
+        <w:t xml:space="preserve"> π -- a function mapping states to actions -- that maximizes the expected long-term discounted reward.</w:t>
       </w:r>
     </w:p>
     <w:p>
@@ -1056,7 +1056,7 @@
           <w:b/>
           <w:sz w:val="24"/>
         </w:rPr>
-        <w:t>Generalized Advantage Estimation (GAE, $\lambda=0.95$, $\gamma=0.99$)</w:t>
+        <w:t>Generalized Advantage Estimation (GAE, λ = 0.95, γ = 0.99)</w:t>
       </w:r>
       <w:r>
         <w:rPr>
@@ -1090,7 +1090,7 @@
           <w:b w:val="0"/>
           <w:sz w:val="24"/>
         </w:rPr>
-        <w:t>: it limits how far the new-to-old policy probability ratio may deviate from 1 (clip range $\epsilon=0.2$) on each update, preventing a single update from being so large that it destroys the learned policy. The loss is</w:t>
+        <w:t>: it limits how far the new-to-old policy probability ratio may deviate from 1 (clip range ε = 0.2) on each update, preventing a single update from being so large that it destroys the learned policy. The loss is</w:t>
       </w:r>
     </w:p>
     <w:p>
@@ -1472,7 +1472,7 @@
                 <w:b w:val="0"/>
                 <w:sz w:val="20"/>
               </w:rPr>
-              <w:t>Velocity command $(v_x, v_y, \omega_{yaw})$</w:t>
+              <w:t>Velocity command (vₓ, v_y, ω_yaw)</w:t>
             </w:r>
           </w:p>
         </w:tc>
@@ -1688,7 +1688,7 @@
                 <w:b w:val="0"/>
                 <w:sz w:val="20"/>
               </w:rPr>
-              <w:t>Track forward velocity $v_x$ (exponential of error)</w:t>
+              <w:t>Track forward velocity vₓ (exponential of error)</w:t>
             </w:r>
           </w:p>
         </w:tc>
@@ -1788,7 +1788,7 @@
                 <w:b w:val="0"/>
                 <w:sz w:val="20"/>
               </w:rPr>
-              <w:t>Track lateral velocity $v_y$</w:t>
+              <w:t>Track lateral velocity v_y</w:t>
             </w:r>
           </w:p>
         </w:tc>
@@ -1838,7 +1838,7 @@
                 <w:b w:val="0"/>
                 <w:sz w:val="20"/>
               </w:rPr>
-              <w:t>Track yaw rate $\omega_{yaw}$</w:t>
+              <w:t>Track yaw rate ω_yaw</w:t>
             </w:r>
           </w:p>
         </w:tc>

</xml_diff>

<commit_message>
Tighten abstracts and give each major section its own page
- Condensed the abstracts to a single focused paragraph (~220 words EN /
  ~800 chars ZH), down from a three-paragraph ~365-word version, matching
  the usual 150-250 word academic-abstract length.
- build_docx.py: every top-level section (Contents, Abstract, each chapter,
  References, Open Source) now starts on its own page via page_break_before.
  For the zh-TW report this puts the Chinese abstract and the English Abstract
  on separate pages (one abstract per page), and removes the stray spacer
  paragraph previously used for the post-cover break.

Co-Authored-By: Claude Opus 4.8 <noreply@anthropic.com>
</commit_message>
<xml_diff>
--- a/docs/report/Final_Report.docx
+++ b/docs/report/Final_Report.docx
@@ -102,12 +102,8 @@
     </w:p>
     <w:p>
       <w:pPr>
+        <w:pStyle w:val="Heading1"/>
         <w:pageBreakBefore/>
-      </w:pPr>
-    </w:p>
-    <w:p>
-      <w:pPr>
-        <w:pStyle w:val="Heading1"/>
         <w:jc w:val="left"/>
       </w:pPr>
       <w:r>
@@ -252,6 +248,7 @@
     <w:p>
       <w:pPr>
         <w:pStyle w:val="Heading1"/>
+        <w:pageBreakBefore/>
         <w:jc w:val="left"/>
       </w:pPr>
       <w:r>
@@ -286,39 +283,7 @@
           <w:b w:val="0"/>
           <w:sz w:val="24"/>
         </w:rPr>
-        <w:t xml:space="preserve"> project: it trains and analyzes a quadruped locomotion controller using neural-network policies, the PPO algorithm, and ablation studies. Reinforcement learning controllers for quadruped robots predominantly rely on </w:t>
-      </w:r>
-      <w:r>
-        <w:rPr>
-          <w:rFonts w:ascii="Times New Roman" w:hAnsi="Times New Roman" w:eastAsia="標楷體"/>
-          <w:b/>
-          <w:sz w:val="24"/>
-        </w:rPr>
-        <w:t>position control</w:t>
-      </w:r>
-      <w:r>
-        <w:rPr>
-          <w:rFonts w:ascii="Times New Roman" w:hAnsi="Times New Roman" w:eastAsia="標楷體"/>
-          <w:b w:val="0"/>
-          <w:sz w:val="24"/>
-        </w:rPr>
-        <w:t xml:space="preserve">: the policy network outputs target joint angles, which a low-level proportional-derivative (PD) controller then converts into joint torques. Position control is easy to train but produces stiff behavior with insufficient compliance, and it tends to overreact when confronted with unforeseen disturbances. </w:t>
-      </w:r>
-      <w:r>
-        <w:rPr>
-          <w:rFonts w:ascii="Times New Roman" w:hAnsi="Times New Roman" w:eastAsia="標楷體"/>
-          <w:b/>
-          <w:sz w:val="24"/>
-        </w:rPr>
-        <w:t>Torque control</w:t>
-      </w:r>
-      <w:r>
-        <w:rPr>
-          <w:rFonts w:ascii="Times New Roman" w:hAnsi="Times New Roman" w:eastAsia="標楷體"/>
-          <w:b w:val="0"/>
-          <w:sz w:val="24"/>
-        </w:rPr>
-        <w:t xml:space="preserve"> commands joint torques directly and is a more compliant alternative, but its action space is highly nonlinear, exploration is inefficient in early training, and it has long been regarded as difficult to train. This report centers on </w:t>
+        <w:t xml:space="preserve"> project that trains and analyzes a torque-based quadruped locomotion controller using neural-network policies, PPO, and ablation studies. Torque control is more compliant than the common position-control scheme, but its highly nonlinear action space and inefficient early exploration make it hard to train. We fully reproduce </w:t>
       </w:r>
       <w:r>
         <w:rPr>
@@ -334,75 +299,7 @@
           <w:b w:val="0"/>
           <w:sz w:val="24"/>
         </w:rPr>
-        <w:t xml:space="preserve"> (arXiv:2502.12674), proposed by Li et al. in 2025 at the marmotlab of the National University of Singapore. We fully reproduce its torque control pipeline on the Unitree Go2 quadruped and analyze it through the lens of questions raised by adaptive and robust control.</w:t>
-      </w:r>
-    </w:p>
-    <w:p>
-      <w:r>
-        <w:rPr>
-          <w:rFonts w:ascii="Times New Roman" w:hAnsi="Times New Roman" w:eastAsia="標楷體"/>
-          <w:b w:val="0"/>
-          <w:sz w:val="24"/>
-        </w:rPr>
-        <w:t xml:space="preserve">The implementation in this study spans two stages. In the </w:t>
-      </w:r>
-      <w:r>
-        <w:rPr>
-          <w:rFonts w:ascii="Times New Roman" w:hAnsi="Times New Roman" w:eastAsia="標楷體"/>
-          <w:b/>
-          <w:sz w:val="24"/>
-        </w:rPr>
-        <w:t>first stage</w:t>
-      </w:r>
-      <w:r>
-        <w:rPr>
-          <w:rFonts w:ascii="Times New Roman" w:hAnsi="Times New Roman" w:eastAsia="標楷體"/>
-          <w:b w:val="0"/>
-          <w:sz w:val="24"/>
-        </w:rPr>
-        <w:t xml:space="preserve">, we reproduce SATA on the Isaac Gym simulator and conduct a systematic four-phase analysis: reproducing the reference policy (eight random seeds), ablating each of the three bio-inspired mechanisms one at a time, evaluating the hardware feasibility of all forty-eight policies under payload and external-force disturbances, and testing a classical residual compensation term. In the </w:t>
-      </w:r>
-      <w:r>
-        <w:rPr>
-          <w:rFonts w:ascii="Times New Roman" w:hAnsi="Times New Roman" w:eastAsia="標楷體"/>
-          <w:b/>
-          <w:sz w:val="24"/>
-        </w:rPr>
-        <w:t>second stage</w:t>
-      </w:r>
-      <w:r>
-        <w:rPr>
-          <w:rFonts w:ascii="Times New Roman" w:hAnsi="Times New Roman" w:eastAsia="標楷體"/>
-          <w:b w:val="0"/>
-          <w:sz w:val="24"/>
-        </w:rPr>
-        <w:t>, we migrate the entire pipeline to NVIDIA's next-generation engine, Isaac Lab, and compare cross-engine fidelity item by item while holding the robot (Go2) fixed as the control variable.</w:t>
-      </w:r>
-    </w:p>
-    <w:p>
-      <w:r>
-        <w:rPr>
-          <w:rFonts w:ascii="Times New Roman" w:hAnsi="Times New Roman" w:eastAsia="標楷體"/>
-          <w:b w:val="0"/>
-          <w:sz w:val="24"/>
-        </w:rPr>
-        <w:t xml:space="preserve">This report emphasizes </w:t>
-      </w:r>
-      <w:r>
-        <w:rPr>
-          <w:rFonts w:ascii="Times New Roman" w:hAnsi="Times New Roman" w:eastAsia="標楷體"/>
-          <w:b/>
-          <w:sz w:val="24"/>
-        </w:rPr>
-        <w:t>hands-on implementation</w:t>
-      </w:r>
-      <w:r>
-        <w:rPr>
-          <w:rFonts w:ascii="Times New Roman" w:hAnsi="Times New Roman" w:eastAsia="標楷體"/>
-          <w:b w:val="0"/>
-          <w:sz w:val="24"/>
-        </w:rPr>
-        <w:t>: all results were trained, evaluated, and reproduced by us, rather than merely cited from the paper. Both projects are open-sourced (links at the end), and anyone may use, inspect, or build upon them under their respective licenses. We maintain statistical rigor throughout the analysis (at least five seeds per condition, reporting means and sample standard deviations, and using Welch's t-test), and where a phenomenon cannot be confirmed, we honestly leave it as an open question rather than overclaiming.</w:t>
+        <w:t xml:space="preserve"> (arXiv:2502.12674), which "shapes" the torque action space with biomechanics. The implementation has two stages: on Isaac Gym we reproduce SATA and analyze it with eight seeds, per-mechanism ablation, a hardware-feasibility evaluation of all forty-eight policies, and a classical residual term; we then migrate the whole pipeline to NVIDIA Isaac Lab, holding the robot fixed as the control variable to compare cross-engine fidelity. Main findings: ablations that raise training reward in a clean simulator do so by leaving the hardware-feasible range (peak torque approaching the Go2's 45 N·m limit, with large excesses in energy and jerk); and a faithful port reproduces SATA's per-step task performance (within about 0.002 per step). All results were trained and reproduced by us, both projects are open-sourced, and we maintain statistical rigor throughout (at least five seeds per condition, mean ± sample std, Welch's t-test), leaving unconfirmed phenomena as open questions.</w:t>
       </w:r>
     </w:p>
     <w:p>
@@ -426,6 +323,7 @@
     <w:p>
       <w:pPr>
         <w:pStyle w:val="Heading1"/>
+        <w:pageBreakBefore/>
         <w:jc w:val="left"/>
       </w:pPr>
       <w:r>
@@ -738,6 +636,7 @@
     <w:p>
       <w:pPr>
         <w:pStyle w:val="Heading1"/>
+        <w:pageBreakBefore/>
         <w:jc w:val="left"/>
       </w:pPr>
       <w:r>
@@ -2107,6 +2006,7 @@
     <w:p>
       <w:pPr>
         <w:pStyle w:val="Heading1"/>
+        <w:pageBreakBefore/>
         <w:jc w:val="left"/>
       </w:pPr>
       <w:r>
@@ -2402,6 +2302,7 @@
     <w:p>
       <w:pPr>
         <w:pStyle w:val="Heading1"/>
+        <w:pageBreakBefore/>
         <w:jc w:val="left"/>
       </w:pPr>
       <w:r>
@@ -3517,6 +3418,7 @@
     <w:p>
       <w:pPr>
         <w:pStyle w:val="Heading1"/>
+        <w:pageBreakBefore/>
         <w:jc w:val="left"/>
       </w:pPr>
       <w:r>
@@ -4059,6 +3961,7 @@
     <w:p>
       <w:pPr>
         <w:pStyle w:val="Heading1"/>
+        <w:pageBreakBefore/>
         <w:jc w:val="left"/>
       </w:pPr>
       <w:r>
@@ -4235,6 +4138,7 @@
     <w:p>
       <w:pPr>
         <w:pStyle w:val="Heading1"/>
+        <w:pageBreakBefore/>
         <w:jc w:val="left"/>
       </w:pPr>
       <w:r>
@@ -4285,6 +4189,7 @@
     <w:p>
       <w:pPr>
         <w:pStyle w:val="Heading1"/>
+        <w:pageBreakBefore/>
         <w:jc w:val="left"/>
       </w:pPr>
       <w:r>
@@ -4429,6 +4334,7 @@
     <w:p>
       <w:pPr>
         <w:pStyle w:val="Heading1"/>
+        <w:pageBreakBefore/>
         <w:jc w:val="left"/>
       </w:pPr>
       <w:r>

</xml_diff>

<commit_message>
Rebalance abstracts: restore key detail after over-trimming
The previous condensation cut the abstracts too short (down to ~220 words),
losing concrete substance. Rebalanced to two paragraphs (~300 words EN /
~1000 chars ZH): restored why position control is stiff, the three named bio
mechanisms, the counter-intuitive core finding with numbers (42.5 N·m peak,
2.5x energy, 35x jerk; "feasibility constraints, not reward devices"), and the
cross-engine per-step result. Still one page each. Also fixed a tab-escape
artifact (2.5<TAB>imes -> 2.5x) introduced during the previous edit.

Co-Authored-By: Claude Opus 4.8 <noreply@anthropic.com>
</commit_message>
<xml_diff>
--- a/docs/report/Final_Report.docx
+++ b/docs/report/Final_Report.docx
@@ -283,7 +283,39 @@
           <w:b w:val="0"/>
           <w:sz w:val="24"/>
         </w:rPr>
-        <w:t xml:space="preserve"> project that trains and analyzes a torque-based quadruped locomotion controller using neural-network policies, PPO, and ablation studies. Torque control is more compliant than the common position-control scheme, but its highly nonlinear action space and inefficient early exploration make it hard to train. We fully reproduce </w:t>
+        <w:t xml:space="preserve"> project that trains and analyzes a torque-based quadruped locomotion controller using neural-network policies, Proximal Policy Optimization (PPO), and ablation studies. Most RL controllers use </w:t>
+      </w:r>
+      <w:r>
+        <w:rPr>
+          <w:rFonts w:ascii="Times New Roman" w:hAnsi="Times New Roman" w:eastAsia="標楷體"/>
+          <w:b/>
+          <w:sz w:val="24"/>
+        </w:rPr>
+        <w:t>position control</w:t>
+      </w:r>
+      <w:r>
+        <w:rPr>
+          <w:rFonts w:ascii="Times New Roman" w:hAnsi="Times New Roman" w:eastAsia="標楷體"/>
+          <w:b w:val="0"/>
+          <w:sz w:val="24"/>
+        </w:rPr>
+        <w:t xml:space="preserve"> (outputting target joint angles that a low-level PD controller converts to torque): easy to train, but stiff, insufficiently compliant, and prone to overreacting to disturbances. </w:t>
+      </w:r>
+      <w:r>
+        <w:rPr>
+          <w:rFonts w:ascii="Times New Roman" w:hAnsi="Times New Roman" w:eastAsia="標楷體"/>
+          <w:b/>
+          <w:sz w:val="24"/>
+        </w:rPr>
+        <w:t>Torque control</w:t>
+      </w:r>
+      <w:r>
+        <w:rPr>
+          <w:rFonts w:ascii="Times New Roman" w:hAnsi="Times New Roman" w:eastAsia="標楷體"/>
+          <w:b w:val="0"/>
+          <w:sz w:val="24"/>
+        </w:rPr>
+        <w:t xml:space="preserve"> commands joint torques directly and is more compliant, but its highly nonlinear action space and inefficient early exploration have long made it hard to train. We fully reproduce </w:t>
       </w:r>
       <w:r>
         <w:rPr>
@@ -299,7 +331,17 @@
           <w:b w:val="0"/>
           <w:sz w:val="24"/>
         </w:rPr>
-        <w:t xml:space="preserve"> (arXiv:2502.12674), which "shapes" the torque action space with biomechanics. The implementation has two stages: on Isaac Gym we reproduce SATA and analyze it with eight seeds, per-mechanism ablation, a hardware-feasibility evaluation of all forty-eight policies, and a classical residual term; we then migrate the whole pipeline to NVIDIA Isaac Lab, holding the robot fixed as the control variable to compare cross-engine fidelity. Main findings: ablations that raise training reward in a clean simulator do so by leaving the hardware-feasible range (peak torque approaching the Go2's 45 N·m limit, with large excesses in energy and jerk); and a faithful port reproduces SATA's per-step task performance (within about 0.002 per step). All results were trained and reproduced by us, both projects are open-sourced, and we maintain statistical rigor throughout (at least five seeds per condition, mean ± sample std, Welch's t-test), leaving unconfirmed phenomena as open questions.</w:t>
+        <w:t xml:space="preserve"> (arXiv:2502.12674), which "shapes" the torque action space with three bio-inspired mechanisms (activation low-pass, Hill force-velocity model, motor fatigue) plus a developmental growth curriculum, making it both easier to learn and more physically feasible.</w:t>
+      </w:r>
+    </w:p>
+    <w:p>
+      <w:r>
+        <w:rPr>
+          <w:rFonts w:ascii="Times New Roman" w:hAnsi="Times New Roman" w:eastAsia="標楷體"/>
+          <w:b w:val="0"/>
+          <w:sz w:val="24"/>
+        </w:rPr>
+        <w:t>The implementation has two stages. On Isaac Gym we reproduce SATA (eight seeds, reward 103.9 ± 15.9) and analyze it via per-mechanism ablation, a hardware-feasibility evaluation of all forty-eight policies under payload and push disturbances, and a classical residual term. The core finding is counter-intuitive: ablations that *raise* training reward in a clean simulator do so by *leaving the hardware-feasible range*—disabling activation drives peak torque to 42.5 N·m (near the real Go2's 45 N·m limit), and disabling fatigue uses 2.5× energy and 35× action jerk. The bio mechanisms thus act as sim-to-real feasibility constraints, not reward devices. The second stage migrates the pipeline to NVIDIA Isaac Lab, holding the robot fixed as the control variable: a faithful port reproduces SATA's per-step task performance (positive task terms within about 0.002 per step). All results were trained, evaluated, and reproduced by us; both projects are open-sourced. We maintain statistical rigor throughout (at least five seeds per condition, mean ± sample std, Welch's t-test) and leave unconfirmed phenomena (e.g., trainability) as open questions rather than overclaiming.</w:t>
       </w:r>
     </w:p>
     <w:p>

</xml_diff>

<commit_message>
Cover and ToC: distribute vertical space instead of crowding the top
The cover and ToC pages crammed all content into the upper half. Fixes in
build_docx.py:
- Cover now lays out as three vertical regions (org/course on top, the
  Chinese+English titles in the middle, author/ID/advisor/date at the bottom).
  The inter-region gaps are computed adaptively from the cover's text height so
  each variant fills ~80-90% of the page regardless of how many lines it has
  (the generic English cover has no course/advisor line, so it gets larger gaps).
  Target capped at 80% page height to keep a bottom buffer against title wrap.
- ToC heading gets larger space-after so the (short) contents list is not
  jammed directly under the cramped top.
- Removed the stray spacer paragraph; the post-cover page break is the ToC
  heading's page_break_before.

Verified all three covers stay on one page (no overflow to page 2).

Co-Authored-By: Claude Opus 4.8 <noreply@anthropic.com>
</commit_message>
<xml_diff>
--- a/docs/report/Final_Report.docx
+++ b/docs/report/Final_Report.docx
@@ -4,63 +4,63 @@
   <w:body>
     <w:p>
       <w:pPr>
-        <w:spacing w:after="200" w:before="560"/>
+        <w:spacing w:after="120" w:before="1602"/>
         <w:jc w:val="center"/>
       </w:pPr>
       <w:r>
         <w:rPr>
           <w:rFonts w:ascii="Times New Roman" w:hAnsi="Times New Roman" w:eastAsia="標楷體"/>
           <w:b w:val="0"/>
-          <w:sz w:val="26"/>
+          <w:sz w:val="28"/>
         </w:rPr>
         <w:t>Department of Biomechatronics Engineering</w:t>
       </w:r>
     </w:p>
     <w:p>
       <w:pPr>
-        <w:spacing w:after="200" w:before="40"/>
+        <w:spacing w:after="120" w:before="120"/>
         <w:jc w:val="center"/>
       </w:pPr>
       <w:r>
         <w:rPr>
           <w:rFonts w:ascii="Times New Roman" w:hAnsi="Times New Roman" w:eastAsia="標楷體"/>
           <w:b w:val="0"/>
-          <w:sz w:val="26"/>
+          <w:sz w:val="28"/>
         </w:rPr>
         <w:t>College of Bioresources and Agriculture</w:t>
       </w:r>
     </w:p>
     <w:p>
       <w:pPr>
-        <w:spacing w:after="200" w:before="40"/>
+        <w:spacing w:after="120" w:before="120"/>
         <w:jc w:val="center"/>
       </w:pPr>
       <w:r>
         <w:rPr>
           <w:rFonts w:ascii="Times New Roman" w:hAnsi="Times New Roman" w:eastAsia="標楷體"/>
           <w:b w:val="0"/>
-          <w:sz w:val="30"/>
+          <w:sz w:val="28"/>
         </w:rPr>
         <w:t>National Taiwan University</w:t>
       </w:r>
     </w:p>
     <w:p>
       <w:pPr>
-        <w:spacing w:after="200" w:before="40"/>
+        <w:spacing w:after="120" w:before="2243"/>
         <w:jc w:val="center"/>
       </w:pPr>
       <w:r>
         <w:rPr>
           <w:rFonts w:ascii="Times New Roman" w:hAnsi="Times New Roman" w:eastAsia="標楷體"/>
-          <w:b w:val="0"/>
-          <w:sz w:val="26"/>
+          <w:b/>
+          <w:sz w:val="32"/>
         </w:rPr>
         <w:t>Reinforcement Learning for Bio-Inspired Torque-Based Quadruped Locomotion: A Cross-Simulator Reproduction and Analysis</w:t>
       </w:r>
     </w:p>
     <w:p>
       <w:pPr>
-        <w:spacing w:after="200" w:before="40"/>
+        <w:spacing w:after="120" w:before="2563"/>
         <w:jc w:val="center"/>
       </w:pPr>
       <w:r>
@@ -74,21 +74,21 @@
     </w:p>
     <w:p>
       <w:pPr>
-        <w:spacing w:after="200" w:before="40"/>
+        <w:spacing w:after="120" w:before="120"/>
         <w:jc w:val="center"/>
       </w:pPr>
       <w:r>
         <w:rPr>
           <w:rFonts w:ascii="Times New Roman" w:hAnsi="Times New Roman" w:eastAsia="標楷體"/>
           <w:b w:val="0"/>
-          <w:sz w:val="26"/>
+          <w:sz w:val="28"/>
         </w:rPr>
         <w:t>Student ID: B11611027</w:t>
       </w:r>
     </w:p>
     <w:p>
       <w:pPr>
-        <w:spacing w:after="200" w:before="40"/>
+        <w:spacing w:after="120" w:before="120"/>
         <w:jc w:val="center"/>
       </w:pPr>
       <w:r>
@@ -104,6 +104,7 @@
       <w:pPr>
         <w:pStyle w:val="Heading1"/>
         <w:pageBreakBefore/>
+        <w:spacing w:after="480"/>
         <w:jc w:val="left"/>
       </w:pPr>
       <w:r>

</xml_diff>